<commit_message>
frontend + registro de frequencia doc
</commit_message>
<xml_diff>
--- a/docs/Prontos/Registro de Frequência/4. REGISTRO DE FREQUÊNCIA DE ATIVIDADES DE EXTENSÃO (grupo).docx
+++ b/docs/Prontos/Registro de Frequência/4. REGISTRO DE FREQUÊNCIA DE ATIVIDADES DE EXTENSÃO (grupo).docx
@@ -86,7 +86,7 @@
                   </w:sdtPr>
                   <w:sdtContent>
                     <w:r>
-                      <w:t>Universidade Católica de Brasília</w:t>
+                      <w:t>Programação Web</w:t>
                     </w:r>
                   </w:sdtContent>
                 </w:sdt>
@@ -120,9 +120,25 @@
                 </w:placeholder>
               </w:sdtPr>
               <w:sdtContent>
-                <w:r>
-                  <w:t>Ranyelson Neres Carvalho</w:t>
-                </w:r>
+                <w:sdt>
+                  <w:sdtPr>
+                    <w:id w:val="-508754212"/>
+                    <w:placeholder>
+                      <w:docPart w:val="563ABDC6FB2E47E8B6DD8056D08C3EC5"/>
+                    </w:placeholder>
+                  </w:sdtPr>
+                  <w:sdtEndPr/>
+                  <w:sdtContent>
+                    <w:proofErr w:type="spellStart"/>
+                    <w:r>
+                      <w:t>Ranyelson</w:t>
+                    </w:r>
+                    <w:proofErr w:type="spellEnd"/>
+                    <w:r>
+                      <w:t xml:space="preserve"> Neres Carvalho</w:t>
+                    </w:r>
+                  </w:sdtContent>
+                </w:sdt>
               </w:sdtContent>
             </w:sdt>
           </w:p>
@@ -152,14 +168,7 @@
                 <w:rFonts w:ascii="Arial" w:hAnsi="Arial" w:cs="Arial"/>
                 <w:b/>
               </w:rPr>
-              <w:t>2</w:t>
-            </w:r>
-            <w:r>
-              <w:rPr>
-                <w:rFonts w:ascii="Arial" w:hAnsi="Arial" w:cs="Arial"/>
-                <w:b/>
-              </w:rPr>
-              <w:t>º Semestre de 2025</w:t>
+              <w:t>1º Semestre de 2026</w:t>
             </w:r>
           </w:p>
         </w:tc>
@@ -214,9 +223,25 @@
                 </w:placeholder>
               </w:sdtPr>
               <w:sdtContent>
-                <w:r>
-                  <w:t>Universidade Católica de Brasília</w:t>
-                </w:r>
+                <w:sdt>
+                  <w:sdtPr>
+                    <w:id w:val="1451363163"/>
+                    <w:placeholder>
+                      <w:docPart w:val="0B86AFAC990941869EF77AE4AD319C1B"/>
+                    </w:placeholder>
+                  </w:sdtPr>
+                  <w:sdtEndPr/>
+                  <w:sdtContent>
+                    <w:proofErr w:type="spellStart"/>
+                    <w:r>
+                      <w:t>Ranyelson</w:t>
+                    </w:r>
+                    <w:proofErr w:type="spellEnd"/>
+                    <w:r>
+                      <w:t xml:space="preserve"> Neres Carvalho</w:t>
+                    </w:r>
+                  </w:sdtContent>
+                </w:sdt>
               </w:sdtContent>
             </w:sdt>
           </w:p>
@@ -254,9 +279,19 @@
                 </w:placeholder>
               </w:sdtPr>
               <w:sdtContent>
-                <w:r>
-                  <w:t>Ranyelson Neres Carvalho</w:t>
-                </w:r>
+                <w:sdt>
+                  <w:sdtPr>
+                    <w:id w:val="-779498652"/>
+                    <w:placeholder>
+                      <w:docPart w:val="CCA66024246945668631B60639D0A4C9"/>
+                    </w:placeholder>
+                  </w:sdtPr>
+                  <w:sdtContent>
+                    <w:r>
+                      <w:t>Universidade Católica de Brasília</w:t>
+                    </w:r>
+                  </w:sdtContent>
+                </w:sdt>
               </w:sdtContent>
             </w:sdt>
           </w:p>
@@ -286,11 +321,7 @@
                   <w:docPart w:val="DefaultPlaceholder_-1854013440"/>
                 </w:placeholder>
               </w:sdtPr>
-              <w:sdtContent>
-                <w:r>
-                  <w:t>Ranyelson Neres Carvalho</w:t>
-                </w:r>
-              </w:sdtContent>
+              <w:sdtContent/>
             </w:sdt>
           </w:p>
           <w:p>
@@ -325,14 +356,10 @@
                 <w:placeholder>
                   <w:docPart w:val="DefaultPlaceholder_-1854013440"/>
                 </w:placeholder>
-                <w:showingPlcHdr/>
               </w:sdtPr>
               <w:sdtContent>
                 <w:r>
-                  <w:rPr>
-                    <w:rStyle w:val="TextodoEspaoReservado"/>
-                  </w:rPr>
-                  <w:t>Clique ou toque aqui para inserir o texto.</w:t>
+                  <w:t>Otavio Augusto</w:t>
                 </w:r>
               </w:sdtContent>
             </w:sdt>
@@ -369,14 +396,10 @@
                 <w:placeholder>
                   <w:docPart w:val="DefaultPlaceholder_-1854013440"/>
                 </w:placeholder>
-                <w:showingPlcHdr/>
               </w:sdtPr>
               <w:sdtContent>
                 <w:r>
-                  <w:rPr>
-                    <w:rStyle w:val="TextodoEspaoReservado"/>
-                  </w:rPr>
-                  <w:t>Clique ou toque aqui para inserir o texto.</w:t>
+                  <w:t>Matheus Eduardo</w:t>
                 </w:r>
               </w:sdtContent>
             </w:sdt>
@@ -413,14 +436,10 @@
                 <w:placeholder>
                   <w:docPart w:val="DefaultPlaceholder_-1854013440"/>
                 </w:placeholder>
-                <w:showingPlcHdr/>
               </w:sdtPr>
               <w:sdtContent>
                 <w:r>
-                  <w:rPr>
-                    <w:rStyle w:val="TextodoEspaoReservado"/>
-                  </w:rPr>
-                  <w:t>Clique ou toque aqui para inserir o texto.</w:t>
+                  <w:t>Manoel Pedro</w:t>
                 </w:r>
               </w:sdtContent>
             </w:sdt>
@@ -457,14 +476,10 @@
                 <w:placeholder>
                   <w:docPart w:val="DefaultPlaceholder_-1854013440"/>
                 </w:placeholder>
-                <w:showingPlcHdr/>
               </w:sdtPr>
               <w:sdtContent>
                 <w:r>
-                  <w:rPr>
-                    <w:rStyle w:val="TextodoEspaoReservado"/>
-                  </w:rPr>
-                  <w:t>Clique ou toque aqui para inserir o texto.</w:t>
+                  <w:t>Luís Fernando</w:t>
                 </w:r>
               </w:sdtContent>
             </w:sdt>
@@ -501,14 +516,10 @@
                 <w:placeholder>
                   <w:docPart w:val="DefaultPlaceholder_-1854013440"/>
                 </w:placeholder>
-                <w:showingPlcHdr/>
               </w:sdtPr>
               <w:sdtContent>
                 <w:r>
-                  <w:rPr>
-                    <w:rStyle w:val="TextodoEspaoReservado"/>
-                  </w:rPr>
-                  <w:t>Clique ou toque aqui para inserir o texto.</w:t>
+                  <w:t>Lucas Costa</w:t>
                 </w:r>
               </w:sdtContent>
             </w:sdt>
@@ -545,14 +556,10 @@
                 <w:placeholder>
                   <w:docPart w:val="DefaultPlaceholder_-1854013440"/>
                 </w:placeholder>
-                <w:showingPlcHdr/>
               </w:sdtPr>
               <w:sdtContent>
                 <w:r>
-                  <w:rPr>
-                    <w:rStyle w:val="TextodoEspaoReservado"/>
-                  </w:rPr>
-                  <w:t>Clique ou toque aqui para inserir o texto.</w:t>
+                  <w:t>Lucas Vasconcellos</w:t>
                 </w:r>
               </w:sdtContent>
             </w:sdt>
@@ -560,12 +567,18 @@
           <w:p>
             <w:pPr>
               <w:spacing w:after="0" w:line="360" w:lineRule="auto"/>
-              <w:jc w:val="center"/>
               <w:rPr>
                 <w:rFonts w:ascii="Arial" w:hAnsi="Arial" w:cs="Arial"/>
                 <w:b/>
               </w:rPr>
             </w:pPr>
+            <w:r>
+              <w:rPr>
+                <w:rFonts w:ascii="Arial" w:hAnsi="Arial"/>
+                <w:b/>
+              </w:rPr>
+              <w:t>7. Leandro Marcelino</w:t>
+            </w:r>
           </w:p>
         </w:tc>
       </w:tr>
@@ -597,10 +610,10 @@
         <w:tblLook w:val="04A0" w:firstRow="1" w:lastRow="0" w:firstColumn="1" w:lastColumn="0" w:noHBand="0" w:noVBand="1"/>
       </w:tblPr>
       <w:tblGrid>
-        <w:gridCol w:w="970"/>
-        <w:gridCol w:w="2144"/>
-        <w:gridCol w:w="3827"/>
-        <w:gridCol w:w="3209"/>
+        <w:gridCol w:w="1242"/>
+        <w:gridCol w:w="2075"/>
+        <w:gridCol w:w="3722"/>
+        <w:gridCol w:w="3111"/>
       </w:tblGrid>
       <w:tr>
         <w:trPr>
@@ -781,6 +794,12 @@
                 <w:rFonts w:ascii="Arial" w:hAnsi="Arial" w:cs="Arial"/>
               </w:rPr>
             </w:pPr>
+            <w:r>
+              <w:rPr>
+                <w:rFonts w:ascii="Arial" w:hAnsi="Arial"/>
+              </w:rPr>
+              <w:t>25/05/2026</w:t>
+            </w:r>
           </w:p>
         </w:tc>
         <w:tc>
@@ -802,6 +821,12 @@
                 <w:rFonts w:ascii="Arial" w:hAnsi="Arial" w:cs="Arial"/>
               </w:rPr>
             </w:pPr>
+            <w:r>
+              <w:rPr>
+                <w:rFonts w:ascii="Arial" w:hAnsi="Arial"/>
+              </w:rPr>
+              <w:t>3h</w:t>
+            </w:r>
           </w:p>
         </w:tc>
         <w:tc>
@@ -823,6 +848,12 @@
                 <w:rFonts w:ascii="Arial" w:hAnsi="Arial" w:cs="Arial"/>
               </w:rPr>
             </w:pPr>
+            <w:r>
+              <w:rPr>
+                <w:rFonts w:ascii="Arial" w:hAnsi="Arial"/>
+              </w:rPr>
+              <w:t>Reunião inicial: planejamento do projeto, definição de papéis e cronograma</w:t>
+            </w:r>
           </w:p>
         </w:tc>
         <w:tc>
@@ -843,6 +874,12 @@
                 <w:rFonts w:ascii="Arial" w:hAnsi="Arial" w:cs="Arial"/>
               </w:rPr>
             </w:pPr>
+            <w:r>
+              <w:rPr>
+                <w:rFonts w:ascii="Arial" w:hAnsi="Arial"/>
+              </w:rPr>
+              <w:t>SRA</w:t>
+            </w:r>
           </w:p>
         </w:tc>
       </w:tr>
@@ -868,6 +905,12 @@
                 <w:rFonts w:ascii="Arial" w:hAnsi="Arial" w:cs="Arial"/>
               </w:rPr>
             </w:pPr>
+            <w:r>
+              <w:rPr>
+                <w:rFonts w:ascii="Arial" w:hAnsi="Arial"/>
+              </w:rPr>
+              <w:t>26/05/2026</w:t>
+            </w:r>
           </w:p>
         </w:tc>
         <w:tc>
@@ -889,6 +932,12 @@
                 <w:rFonts w:ascii="Arial" w:hAnsi="Arial" w:cs="Arial"/>
               </w:rPr>
             </w:pPr>
+            <w:r>
+              <w:rPr>
+                <w:rFonts w:ascii="Arial" w:hAnsi="Arial"/>
+              </w:rPr>
+              <w:t>4h</w:t>
+            </w:r>
           </w:p>
         </w:tc>
         <w:tc>
@@ -910,6 +959,12 @@
                 <w:rFonts w:ascii="Arial" w:hAnsi="Arial" w:cs="Arial"/>
               </w:rPr>
             </w:pPr>
+            <w:r>
+              <w:rPr>
+                <w:rFonts w:ascii="Arial" w:hAnsi="Arial"/>
+              </w:rPr>
+              <w:t>Estudo da realidade e mapeamento das demandas da instituição</w:t>
+            </w:r>
           </w:p>
         </w:tc>
         <w:tc>
@@ -930,6 +985,12 @@
                 <w:rFonts w:ascii="Arial" w:hAnsi="Arial" w:cs="Arial"/>
               </w:rPr>
             </w:pPr>
+            <w:r>
+              <w:rPr>
+                <w:rFonts w:ascii="Arial" w:hAnsi="Arial"/>
+              </w:rPr>
+              <w:t>SRA</w:t>
+            </w:r>
           </w:p>
         </w:tc>
       </w:tr>
@@ -955,6 +1016,12 @@
                 <w:rFonts w:ascii="Arial" w:hAnsi="Arial" w:cs="Arial"/>
               </w:rPr>
             </w:pPr>
+            <w:r>
+              <w:rPr>
+                <w:rFonts w:ascii="Arial" w:hAnsi="Arial"/>
+              </w:rPr>
+              <w:t>27/05/2026</w:t>
+            </w:r>
           </w:p>
         </w:tc>
         <w:tc>
@@ -976,6 +1043,12 @@
                 <w:rFonts w:ascii="Arial" w:hAnsi="Arial" w:cs="Arial"/>
               </w:rPr>
             </w:pPr>
+            <w:r>
+              <w:rPr>
+                <w:rFonts w:ascii="Arial" w:hAnsi="Arial"/>
+              </w:rPr>
+              <w:t>4h</w:t>
+            </w:r>
           </w:p>
         </w:tc>
         <w:tc>
@@ -997,6 +1070,12 @@
                 <w:rFonts w:ascii="Arial" w:hAnsi="Arial" w:cs="Arial"/>
               </w:rPr>
             </w:pPr>
+            <w:r>
+              <w:rPr>
+                <w:rFonts w:ascii="Arial" w:hAnsi="Arial"/>
+              </w:rPr>
+              <w:t>Visita diagnóstica e entrevista com a coordenação da instituição</w:t>
+            </w:r>
           </w:p>
         </w:tc>
         <w:tc>
@@ -1017,6 +1096,12 @@
                 <w:rFonts w:ascii="Arial" w:hAnsi="Arial" w:cs="Arial"/>
               </w:rPr>
             </w:pPr>
+            <w:r>
+              <w:rPr>
+                <w:rFonts w:ascii="Arial" w:hAnsi="Arial"/>
+              </w:rPr>
+              <w:t>SRA</w:t>
+            </w:r>
           </w:p>
         </w:tc>
       </w:tr>
@@ -1042,6 +1127,12 @@
                 <w:rFonts w:ascii="Arial" w:hAnsi="Arial" w:cs="Arial"/>
               </w:rPr>
             </w:pPr>
+            <w:r>
+              <w:rPr>
+                <w:rFonts w:ascii="Arial" w:hAnsi="Arial"/>
+              </w:rPr>
+              <w:t>29/05/2026</w:t>
+            </w:r>
           </w:p>
         </w:tc>
         <w:tc>
@@ -1063,6 +1154,12 @@
                 <w:rFonts w:ascii="Arial" w:hAnsi="Arial" w:cs="Arial"/>
               </w:rPr>
             </w:pPr>
+            <w:r>
+              <w:rPr>
+                <w:rFonts w:ascii="Arial" w:hAnsi="Arial"/>
+              </w:rPr>
+              <w:t>4h</w:t>
+            </w:r>
           </w:p>
         </w:tc>
         <w:tc>
@@ -1084,6 +1181,12 @@
                 <w:rFonts w:ascii="Arial" w:hAnsi="Arial" w:cs="Arial"/>
               </w:rPr>
             </w:pPr>
+            <w:r>
+              <w:rPr>
+                <w:rFonts w:ascii="Arial" w:hAnsi="Arial"/>
+              </w:rPr>
+              <w:t>Definição de requisitos e escopo do sistema</w:t>
+            </w:r>
           </w:p>
         </w:tc>
         <w:tc>
@@ -1104,6 +1207,12 @@
                 <w:rFonts w:ascii="Arial" w:hAnsi="Arial" w:cs="Arial"/>
               </w:rPr>
             </w:pPr>
+            <w:r>
+              <w:rPr>
+                <w:rFonts w:ascii="Arial" w:hAnsi="Arial"/>
+              </w:rPr>
+              <w:t>SRA</w:t>
+            </w:r>
           </w:p>
         </w:tc>
       </w:tr>
@@ -1129,6 +1238,12 @@
                 <w:rFonts w:ascii="Arial" w:hAnsi="Arial" w:cs="Arial"/>
               </w:rPr>
             </w:pPr>
+            <w:r>
+              <w:rPr>
+                <w:rFonts w:ascii="Arial" w:hAnsi="Arial"/>
+              </w:rPr>
+              <w:t>01/06/2026</w:t>
+            </w:r>
           </w:p>
         </w:tc>
         <w:tc>
@@ -1150,6 +1265,12 @@
                 <w:rFonts w:ascii="Arial" w:hAnsi="Arial" w:cs="Arial"/>
               </w:rPr>
             </w:pPr>
+            <w:r>
+              <w:rPr>
+                <w:rFonts w:ascii="Arial" w:hAnsi="Arial"/>
+              </w:rPr>
+              <w:t>4h</w:t>
+            </w:r>
           </w:p>
         </w:tc>
         <w:tc>
@@ -1171,6 +1292,12 @@
                 <w:rFonts w:ascii="Arial" w:hAnsi="Arial" w:cs="Arial"/>
               </w:rPr>
             </w:pPr>
+            <w:r>
+              <w:rPr>
+                <w:rFonts w:ascii="Arial" w:hAnsi="Arial"/>
+              </w:rPr>
+              <w:t>Modelagem do banco de dados e prototipação das telas</w:t>
+            </w:r>
           </w:p>
         </w:tc>
         <w:tc>
@@ -1191,6 +1318,12 @@
                 <w:rFonts w:ascii="Arial" w:hAnsi="Arial" w:cs="Arial"/>
               </w:rPr>
             </w:pPr>
+            <w:r>
+              <w:rPr>
+                <w:rFonts w:ascii="Arial" w:hAnsi="Arial"/>
+              </w:rPr>
+              <w:t>SRA</w:t>
+            </w:r>
           </w:p>
         </w:tc>
       </w:tr>
@@ -1216,6 +1349,12 @@
                 <w:rFonts w:ascii="Arial" w:hAnsi="Arial" w:cs="Arial"/>
               </w:rPr>
             </w:pPr>
+            <w:r>
+              <w:rPr>
+                <w:rFonts w:ascii="Arial" w:hAnsi="Arial"/>
+              </w:rPr>
+              <w:t>03/06/2026</w:t>
+            </w:r>
           </w:p>
         </w:tc>
         <w:tc>
@@ -1237,6 +1376,12 @@
                 <w:rFonts w:ascii="Arial" w:hAnsi="Arial" w:cs="Arial"/>
               </w:rPr>
             </w:pPr>
+            <w:r>
+              <w:rPr>
+                <w:rFonts w:ascii="Arial" w:hAnsi="Arial"/>
+              </w:rPr>
+              <w:t>4h</w:t>
+            </w:r>
           </w:p>
         </w:tc>
         <w:tc>
@@ -1257,6 +1402,12 @@
                 <w:rFonts w:ascii="Arial" w:hAnsi="Arial" w:cs="Arial"/>
               </w:rPr>
             </w:pPr>
+            <w:r>
+              <w:rPr>
+                <w:rFonts w:ascii="Arial" w:hAnsi="Arial"/>
+              </w:rPr>
+              <w:t>Desenvolvimento do back-end: API REST e operações de CRUD</w:t>
+            </w:r>
           </w:p>
         </w:tc>
         <w:tc>
@@ -1277,6 +1428,12 @@
                 <w:rFonts w:ascii="Arial" w:hAnsi="Arial" w:cs="Arial"/>
               </w:rPr>
             </w:pPr>
+            <w:r>
+              <w:rPr>
+                <w:rFonts w:ascii="Arial" w:hAnsi="Arial"/>
+              </w:rPr>
+              <w:t>SRA</w:t>
+            </w:r>
           </w:p>
         </w:tc>
       </w:tr>
@@ -1302,6 +1459,12 @@
                 <w:rFonts w:ascii="Arial" w:hAnsi="Arial" w:cs="Arial"/>
               </w:rPr>
             </w:pPr>
+            <w:r>
+              <w:rPr>
+                <w:rFonts w:ascii="Arial" w:hAnsi="Arial"/>
+              </w:rPr>
+              <w:t>05/06/2026</w:t>
+            </w:r>
           </w:p>
         </w:tc>
         <w:tc>
@@ -1323,6 +1486,12 @@
                 <w:rFonts w:ascii="Arial" w:hAnsi="Arial" w:cs="Arial"/>
               </w:rPr>
             </w:pPr>
+            <w:r>
+              <w:rPr>
+                <w:rFonts w:ascii="Arial" w:hAnsi="Arial"/>
+              </w:rPr>
+              <w:t>4h</w:t>
+            </w:r>
           </w:p>
         </w:tc>
         <w:tc>
@@ -1343,6 +1512,12 @@
                 <w:rFonts w:ascii="Arial" w:hAnsi="Arial" w:cs="Arial"/>
               </w:rPr>
             </w:pPr>
+            <w:r>
+              <w:rPr>
+                <w:rFonts w:ascii="Arial" w:hAnsi="Arial"/>
+              </w:rPr>
+              <w:t>Desenvolvimento do front-end e integração com a API</w:t>
+            </w:r>
           </w:p>
         </w:tc>
         <w:tc>
@@ -1363,6 +1538,12 @@
                 <w:rFonts w:ascii="Arial" w:hAnsi="Arial" w:cs="Arial"/>
               </w:rPr>
             </w:pPr>
+            <w:r>
+              <w:rPr>
+                <w:rFonts w:ascii="Arial" w:hAnsi="Arial"/>
+              </w:rPr>
+              <w:t>SRA</w:t>
+            </w:r>
           </w:p>
         </w:tc>
       </w:tr>
@@ -1388,6 +1569,12 @@
                 <w:rFonts w:ascii="Arial" w:hAnsi="Arial" w:cs="Arial"/>
               </w:rPr>
             </w:pPr>
+            <w:r>
+              <w:rPr>
+                <w:rFonts w:ascii="Arial" w:hAnsi="Arial"/>
+              </w:rPr>
+              <w:t>08/06/2026</w:t>
+            </w:r>
           </w:p>
         </w:tc>
         <w:tc>
@@ -1409,6 +1596,12 @@
                 <w:rFonts w:ascii="Arial" w:hAnsi="Arial" w:cs="Arial"/>
               </w:rPr>
             </w:pPr>
+            <w:r>
+              <w:rPr>
+                <w:rFonts w:ascii="Arial" w:hAnsi="Arial"/>
+              </w:rPr>
+              <w:t>4h</w:t>
+            </w:r>
           </w:p>
         </w:tc>
         <w:tc>
@@ -1429,6 +1622,12 @@
                 <w:rFonts w:ascii="Arial" w:hAnsi="Arial" w:cs="Arial"/>
               </w:rPr>
             </w:pPr>
+            <w:r>
+              <w:rPr>
+                <w:rFonts w:ascii="Arial" w:hAnsi="Arial"/>
+              </w:rPr>
+              <w:t>Implementação dos cadastros de participantes e oficinas</w:t>
+            </w:r>
           </w:p>
         </w:tc>
         <w:tc>
@@ -1449,6 +1648,12 @@
                 <w:rFonts w:ascii="Arial" w:hAnsi="Arial" w:cs="Arial"/>
               </w:rPr>
             </w:pPr>
+            <w:r>
+              <w:rPr>
+                <w:rFonts w:ascii="Arial" w:hAnsi="Arial"/>
+              </w:rPr>
+              <w:t>SRA</w:t>
+            </w:r>
           </w:p>
         </w:tc>
       </w:tr>
@@ -1474,6 +1679,13 @@
                 <w:rFonts w:ascii="Arial" w:hAnsi="Arial" w:cs="Arial"/>
               </w:rPr>
             </w:pPr>
+            <w:r>
+              <w:rPr>
+                <w:rFonts w:ascii="Arial" w:hAnsi="Arial"/>
+              </w:rPr>
+              <w:lastRenderedPageBreak/>
+              <w:t>10/06/2026</w:t>
+            </w:r>
           </w:p>
         </w:tc>
         <w:tc>
@@ -1495,6 +1707,12 @@
                 <w:rFonts w:ascii="Arial" w:hAnsi="Arial" w:cs="Arial"/>
               </w:rPr>
             </w:pPr>
+            <w:r>
+              <w:rPr>
+                <w:rFonts w:ascii="Arial" w:hAnsi="Arial"/>
+              </w:rPr>
+              <w:t>4h</w:t>
+            </w:r>
           </w:p>
         </w:tc>
         <w:tc>
@@ -1515,6 +1733,12 @@
                 <w:rFonts w:ascii="Arial" w:hAnsi="Arial" w:cs="Arial"/>
               </w:rPr>
             </w:pPr>
+            <w:r>
+              <w:rPr>
+                <w:rFonts w:ascii="Arial" w:hAnsi="Arial"/>
+              </w:rPr>
+              <w:t>Implementação do registro de presença e acompanhamento de progresso</w:t>
+            </w:r>
           </w:p>
         </w:tc>
         <w:tc>
@@ -1535,6 +1759,12 @@
                 <w:rFonts w:ascii="Arial" w:hAnsi="Arial" w:cs="Arial"/>
               </w:rPr>
             </w:pPr>
+            <w:r>
+              <w:rPr>
+                <w:rFonts w:ascii="Arial" w:hAnsi="Arial"/>
+              </w:rPr>
+              <w:t>SRA</w:t>
+            </w:r>
           </w:p>
         </w:tc>
       </w:tr>
@@ -1560,6 +1790,12 @@
                 <w:rFonts w:ascii="Arial" w:hAnsi="Arial" w:cs="Arial"/>
               </w:rPr>
             </w:pPr>
+            <w:r>
+              <w:rPr>
+                <w:rFonts w:ascii="Arial" w:hAnsi="Arial"/>
+              </w:rPr>
+              <w:t>12/06/2026</w:t>
+            </w:r>
           </w:p>
         </w:tc>
         <w:tc>
@@ -1580,6 +1816,12 @@
                 <w:rFonts w:ascii="Arial" w:hAnsi="Arial" w:cs="Arial"/>
               </w:rPr>
             </w:pPr>
+            <w:r>
+              <w:rPr>
+                <w:rFonts w:ascii="Arial" w:hAnsi="Arial"/>
+              </w:rPr>
+              <w:t>4h</w:t>
+            </w:r>
           </w:p>
         </w:tc>
         <w:tc>
@@ -1600,6 +1842,12 @@
                 <w:rFonts w:ascii="Arial" w:hAnsi="Arial" w:cs="Arial"/>
               </w:rPr>
             </w:pPr>
+            <w:r>
+              <w:rPr>
+                <w:rFonts w:ascii="Arial" w:hAnsi="Arial"/>
+              </w:rPr>
+              <w:t>Testes, correções e ajustes conforme retorno da instituição</w:t>
+            </w:r>
           </w:p>
         </w:tc>
         <w:tc>
@@ -1620,6 +1868,12 @@
                 <w:rFonts w:ascii="Arial" w:hAnsi="Arial" w:cs="Arial"/>
               </w:rPr>
             </w:pPr>
+            <w:r>
+              <w:rPr>
+                <w:rFonts w:ascii="Arial" w:hAnsi="Arial"/>
+              </w:rPr>
+              <w:t>SRA</w:t>
+            </w:r>
           </w:p>
         </w:tc>
       </w:tr>
@@ -1645,6 +1899,12 @@
                 <w:rFonts w:ascii="Arial" w:hAnsi="Arial" w:cs="Arial"/>
               </w:rPr>
             </w:pPr>
+            <w:r>
+              <w:rPr>
+                <w:rFonts w:ascii="Arial" w:hAnsi="Arial"/>
+              </w:rPr>
+              <w:t>15/06/2026</w:t>
+            </w:r>
           </w:p>
         </w:tc>
         <w:tc>
@@ -1665,6 +1925,12 @@
                 <w:rFonts w:ascii="Arial" w:hAnsi="Arial" w:cs="Arial"/>
               </w:rPr>
             </w:pPr>
+            <w:r>
+              <w:rPr>
+                <w:rFonts w:ascii="Arial" w:hAnsi="Arial"/>
+              </w:rPr>
+              <w:t>3h</w:t>
+            </w:r>
           </w:p>
         </w:tc>
         <w:tc>
@@ -1685,6 +1951,12 @@
                 <w:rFonts w:ascii="Arial" w:hAnsi="Arial" w:cs="Arial"/>
               </w:rPr>
             </w:pPr>
+            <w:r>
+              <w:rPr>
+                <w:rFonts w:ascii="Arial" w:hAnsi="Arial"/>
+              </w:rPr>
+              <w:t>Oficina de orientação de uso do sistema para a equipe</w:t>
+            </w:r>
           </w:p>
         </w:tc>
         <w:tc>
@@ -1705,6 +1977,12 @@
                 <w:rFonts w:ascii="Arial" w:hAnsi="Arial" w:cs="Arial"/>
               </w:rPr>
             </w:pPr>
+            <w:r>
+              <w:rPr>
+                <w:rFonts w:ascii="Arial" w:hAnsi="Arial"/>
+              </w:rPr>
+              <w:t>SRA</w:t>
+            </w:r>
           </w:p>
         </w:tc>
       </w:tr>
@@ -1730,6 +2008,12 @@
                 <w:rFonts w:ascii="Arial" w:hAnsi="Arial" w:cs="Arial"/>
               </w:rPr>
             </w:pPr>
+            <w:r>
+              <w:rPr>
+                <w:rFonts w:ascii="Arial" w:hAnsi="Arial"/>
+              </w:rPr>
+              <w:t>16/06/2026</w:t>
+            </w:r>
           </w:p>
         </w:tc>
         <w:tc>
@@ -1750,6 +2034,12 @@
                 <w:rFonts w:ascii="Arial" w:hAnsi="Arial" w:cs="Arial"/>
               </w:rPr>
             </w:pPr>
+            <w:r>
+              <w:rPr>
+                <w:rFonts w:ascii="Arial" w:hAnsi="Arial"/>
+              </w:rPr>
+              <w:t>4h</w:t>
+            </w:r>
           </w:p>
         </w:tc>
         <w:tc>
@@ -1770,6 +2060,12 @@
                 <w:rFonts w:ascii="Arial" w:hAnsi="Arial" w:cs="Arial"/>
               </w:rPr>
             </w:pPr>
+            <w:r>
+              <w:rPr>
+                <w:rFonts w:ascii="Arial" w:hAnsi="Arial"/>
+              </w:rPr>
+              <w:t>Apresentação final do sistema e encerramento das atividades</w:t>
+            </w:r>
           </w:p>
         </w:tc>
         <w:tc>
@@ -1790,6 +2086,12 @@
                 <w:rFonts w:ascii="Arial" w:hAnsi="Arial" w:cs="Arial"/>
               </w:rPr>
             </w:pPr>
+            <w:r>
+              <w:rPr>
+                <w:rFonts w:ascii="Arial" w:hAnsi="Arial"/>
+              </w:rPr>
+              <w:t>SRA</w:t>
+            </w:r>
           </w:p>
         </w:tc>
       </w:tr>
@@ -2005,9 +2307,25 @@
                 </w:placeholder>
               </w:sdtPr>
               <w:sdtContent>
-                <w:r>
-                  <w:t>Ranyelson Neres Carvalho</w:t>
-                </w:r>
+                <w:sdt>
+                  <w:sdtPr>
+                    <w:id w:val="1301269992"/>
+                    <w:placeholder>
+                      <w:docPart w:val="F2F0E0FA65E74018A86A776547B8C280"/>
+                    </w:placeholder>
+                  </w:sdtPr>
+                  <w:sdtEndPr/>
+                  <w:sdtContent>
+                    <w:proofErr w:type="spellStart"/>
+                    <w:r>
+                      <w:t>Ranyelson</w:t>
+                    </w:r>
+                    <w:proofErr w:type="spellEnd"/>
+                    <w:r>
+                      <w:t xml:space="preserve"> Neres Carvalho</w:t>
+                    </w:r>
+                  </w:sdtContent>
+                </w:sdt>
               </w:sdtContent>
             </w:sdt>
           </w:p>
@@ -2086,9 +2404,25 @@
                 </w:placeholder>
               </w:sdtPr>
               <w:sdtContent>
-                <w:r>
-                  <w:t>Ranyelson Neres Carvalho</w:t>
-                </w:r>
+                <w:sdt>
+                  <w:sdtPr>
+                    <w:id w:val="-546601877"/>
+                    <w:placeholder>
+                      <w:docPart w:val="B3A660886CF2425EA7BB21AD47B7C915"/>
+                    </w:placeholder>
+                  </w:sdtPr>
+                  <w:sdtEndPr/>
+                  <w:sdtContent>
+                    <w:proofErr w:type="spellStart"/>
+                    <w:r>
+                      <w:t>Ranyelson</w:t>
+                    </w:r>
+                    <w:proofErr w:type="spellEnd"/>
+                    <w:r>
+                      <w:t xml:space="preserve"> Neres Carvalho</w:t>
+                    </w:r>
+                  </w:sdtContent>
+                </w:sdt>
               </w:sdtContent>
             </w:sdt>
           </w:p>
@@ -2285,7 +2619,10 @@
         </w:sdtPr>
         <w:sdtContent>
           <w:r>
-            <w:t>06</w:t>
+            <w:t>1</w:t>
+          </w:r>
+          <w:r>
+            <w:t>9</w:t>
           </w:r>
         </w:sdtContent>
       </w:sdt>
@@ -3832,6 +4169,151 @@
         </w:p>
       </w:docPartBody>
     </w:docPart>
+    <w:docPart>
+      <w:docPartPr>
+        <w:name w:val="563ABDC6FB2E47E8B6DD8056D08C3EC5"/>
+        <w:category>
+          <w:name w:val="Geral"/>
+          <w:gallery w:val="placeholder"/>
+        </w:category>
+        <w:types>
+          <w:type w:val="bbPlcHdr"/>
+        </w:types>
+        <w:behaviors>
+          <w:behavior w:val="content"/>
+        </w:behaviors>
+        <w:guid w:val="{97C76486-F55C-4B51-A424-4998953B5374}"/>
+      </w:docPartPr>
+      <w:docPartBody>
+        <w:p>
+          <w:pPr>
+            <w:pStyle w:val="563ABDC6FB2E47E8B6DD8056D08C3EC5"/>
+          </w:pPr>
+          <w:r>
+            <w:rPr>
+              <w:rStyle w:val="TextodoEspaoReservado"/>
+            </w:rPr>
+            <w:t>Clique ou toque aqui para inserir o texto.</w:t>
+          </w:r>
+        </w:p>
+      </w:docPartBody>
+    </w:docPart>
+    <w:docPart>
+      <w:docPartPr>
+        <w:name w:val="F2F0E0FA65E74018A86A776547B8C280"/>
+        <w:category>
+          <w:name w:val="Geral"/>
+          <w:gallery w:val="placeholder"/>
+        </w:category>
+        <w:types>
+          <w:type w:val="bbPlcHdr"/>
+        </w:types>
+        <w:behaviors>
+          <w:behavior w:val="content"/>
+        </w:behaviors>
+        <w:guid w:val="{76CA71BB-3E9F-4493-8906-C573F040E036}"/>
+      </w:docPartPr>
+      <w:docPartBody>
+        <w:p>
+          <w:pPr>
+            <w:pStyle w:val="F2F0E0FA65E74018A86A776547B8C280"/>
+          </w:pPr>
+          <w:r>
+            <w:rPr>
+              <w:rStyle w:val="TextodoEspaoReservado"/>
+            </w:rPr>
+            <w:t>Clique ou toque aqui para inserir o texto.</w:t>
+          </w:r>
+        </w:p>
+      </w:docPartBody>
+    </w:docPart>
+    <w:docPart>
+      <w:docPartPr>
+        <w:name w:val="B3A660886CF2425EA7BB21AD47B7C915"/>
+        <w:category>
+          <w:name w:val="Geral"/>
+          <w:gallery w:val="placeholder"/>
+        </w:category>
+        <w:types>
+          <w:type w:val="bbPlcHdr"/>
+        </w:types>
+        <w:behaviors>
+          <w:behavior w:val="content"/>
+        </w:behaviors>
+        <w:guid w:val="{18F7C8DB-4CF7-4588-BDFB-04EDF48953DB}"/>
+      </w:docPartPr>
+      <w:docPartBody>
+        <w:p>
+          <w:pPr>
+            <w:pStyle w:val="B3A660886CF2425EA7BB21AD47B7C915"/>
+          </w:pPr>
+          <w:r>
+            <w:rPr>
+              <w:rStyle w:val="TextodoEspaoReservado"/>
+            </w:rPr>
+            <w:t>Clique ou toque aqui para inserir o texto.</w:t>
+          </w:r>
+        </w:p>
+      </w:docPartBody>
+    </w:docPart>
+    <w:docPart>
+      <w:docPartPr>
+        <w:name w:val="0B86AFAC990941869EF77AE4AD319C1B"/>
+        <w:category>
+          <w:name w:val="Geral"/>
+          <w:gallery w:val="placeholder"/>
+        </w:category>
+        <w:types>
+          <w:type w:val="bbPlcHdr"/>
+        </w:types>
+        <w:behaviors>
+          <w:behavior w:val="content"/>
+        </w:behaviors>
+        <w:guid w:val="{B01E4F49-B7D1-497E-942C-95A9E3819D6C}"/>
+      </w:docPartPr>
+      <w:docPartBody>
+        <w:p>
+          <w:pPr>
+            <w:pStyle w:val="0B86AFAC990941869EF77AE4AD319C1B"/>
+          </w:pPr>
+          <w:r>
+            <w:rPr>
+              <w:rStyle w:val="TextodoEspaoReservado"/>
+            </w:rPr>
+            <w:t>Clique ou toque aqui para inserir o texto.</w:t>
+          </w:r>
+        </w:p>
+      </w:docPartBody>
+    </w:docPart>
+    <w:docPart>
+      <w:docPartPr>
+        <w:name w:val="CCA66024246945668631B60639D0A4C9"/>
+        <w:category>
+          <w:name w:val="Geral"/>
+          <w:gallery w:val="placeholder"/>
+        </w:category>
+        <w:types>
+          <w:type w:val="bbPlcHdr"/>
+        </w:types>
+        <w:behaviors>
+          <w:behavior w:val="content"/>
+        </w:behaviors>
+        <w:guid w:val="{481D822E-BF17-40B2-9EAD-0BA69A082B12}"/>
+      </w:docPartPr>
+      <w:docPartBody>
+        <w:p>
+          <w:pPr>
+            <w:pStyle w:val="CCA66024246945668631B60639D0A4C9"/>
+          </w:pPr>
+          <w:r>
+            <w:rPr>
+              <w:rStyle w:val="TextodoEspaoReservado"/>
+            </w:rPr>
+            <w:t>Clique ou toque aqui para inserir o texto.</w:t>
+          </w:r>
+        </w:p>
+      </w:docPartBody>
+    </w:docPart>
   </w:docParts>
 </w:glossaryDocument>
 </file>
@@ -3843,7 +4325,7 @@
     <w:charset w:val="00"/>
     <w:family w:val="swiss"/>
     <w:pitch w:val="variable"/>
-    <w:sig w:usb0="E0002AFF" w:usb1="C000247B" w:usb2="00000009" w:usb3="00000000" w:csb0="000001FF" w:csb1="00000000"/>
+    <w:sig w:usb0="E4002EFF" w:usb1="C000247B" w:usb2="00000009" w:usb3="00000000" w:csb0="000001FF" w:csb1="00000000"/>
   </w:font>
   <w:font w:name="Times New Roman">
     <w:panose1 w:val="02020603050405020304"/>
@@ -3853,14 +4335,12 @@
     <w:sig w:usb0="E0002EFF" w:usb1="C000785B" w:usb2="00000009" w:usb3="00000000" w:csb0="000001FF" w:csb1="00000000"/>
   </w:font>
   <w:font w:name="Aptos">
-    <w:panose1 w:val="020B0004020202020204"/>
     <w:charset w:val="00"/>
     <w:family w:val="swiss"/>
     <w:pitch w:val="variable"/>
     <w:sig w:usb0="20000287" w:usb1="00000003" w:usb2="00000000" w:usb3="00000000" w:csb0="0000019F" w:csb1="00000000"/>
   </w:font>
   <w:font w:name="Aptos Display">
-    <w:panose1 w:val="020B0004020202020204"/>
     <w:charset w:val="00"/>
     <w:family w:val="swiss"/>
     <w:pitch w:val="variable"/>
@@ -3871,7 +4351,7 @@
     <w:charset w:val="00"/>
     <w:family w:val="swiss"/>
     <w:pitch w:val="variable"/>
-    <w:sig w:usb0="E0002AFF" w:usb1="C0007843" w:usb2="00000009" w:usb3="00000000" w:csb0="000001FF" w:csb1="00000000"/>
+    <w:sig w:usb0="E0002EFF" w:usb1="C000785B" w:usb2="00000009" w:usb3="00000000" w:csb0="000001FF" w:csb1="00000000"/>
   </w:font>
 </w:fonts>
 </file>
@@ -3901,7 +4381,9 @@
     <w:rsid w:val="0039550E"/>
     <w:rsid w:val="003F14AE"/>
     <w:rsid w:val="004D2FDF"/>
+    <w:rsid w:val="00541E8E"/>
     <w:rsid w:val="005F07DB"/>
+    <w:rsid w:val="00645EC7"/>
     <w:rsid w:val="0065253B"/>
     <w:rsid w:val="00660EE6"/>
     <w:rsid w:val="007254D5"/>
@@ -3916,6 +4398,7 @@
     <w:rsid w:val="00CA1817"/>
     <w:rsid w:val="00E520A6"/>
     <w:rsid w:val="00E97593"/>
+    <w:rsid w:val="00FF1F46"/>
   </w:rsids>
   <m:mathPr>
     <m:mathFont m:val="Cambria Math"/>
@@ -4371,7 +4854,7 @@
     <w:basedOn w:val="Fontepargpadro"/>
     <w:uiPriority w:val="99"/>
     <w:semiHidden/>
-    <w:rsid w:val="003F14AE"/>
+    <w:rsid w:val="00FF1F46"/>
     <w:rPr>
       <w:color w:val="666666"/>
     </w:rPr>
@@ -4379,6 +4862,26 @@
   <w:style w:type="paragraph" w:customStyle="1" w:styleId="B27701D6DF1DF54B86461895779DA992">
     <w:name w:val="B27701D6DF1DF54B86461895779DA992"/>
     <w:rsid w:val="003F14AE"/>
+  </w:style>
+  <w:style w:type="paragraph" w:customStyle="1" w:styleId="563ABDC6FB2E47E8B6DD8056D08C3EC5">
+    <w:name w:val="563ABDC6FB2E47E8B6DD8056D08C3EC5"/>
+    <w:rsid w:val="00FF1F46"/>
+  </w:style>
+  <w:style w:type="paragraph" w:customStyle="1" w:styleId="F2F0E0FA65E74018A86A776547B8C280">
+    <w:name w:val="F2F0E0FA65E74018A86A776547B8C280"/>
+    <w:rsid w:val="00FF1F46"/>
+  </w:style>
+  <w:style w:type="paragraph" w:customStyle="1" w:styleId="B3A660886CF2425EA7BB21AD47B7C915">
+    <w:name w:val="B3A660886CF2425EA7BB21AD47B7C915"/>
+    <w:rsid w:val="00FF1F46"/>
+  </w:style>
+  <w:style w:type="paragraph" w:customStyle="1" w:styleId="0B86AFAC990941869EF77AE4AD319C1B">
+    <w:name w:val="0B86AFAC990941869EF77AE4AD319C1B"/>
+    <w:rsid w:val="00FF1F46"/>
+  </w:style>
+  <w:style w:type="paragraph" w:customStyle="1" w:styleId="CCA66024246945668631B60639D0A4C9">
+    <w:name w:val="CCA66024246945668631B60639D0A4C9"/>
+    <w:rsid w:val="00FF1F46"/>
   </w:style>
 </w:styles>
 </file>

</xml_diff>